<commit_message>
NPTEL Week 3 started
</commit_message>
<xml_diff>
--- a/Part 01/S04.NN&Regularization/Notes.docx
+++ b/Part 01/S04.NN&Regularization/Notes.docx
@@ -7,6 +7,9 @@
         <w:pStyle w:val="Subtitle"/>
       </w:pPr>
       <w:r>
+        <w:rPr>
+          <w:noProof/>
+        </w:rPr>
         <w:drawing>
           <wp:inline distT="0" distB="0" distL="0" distR="0" wp14:anchorId="28BF7515" wp14:editId="5A67C145">
             <wp:extent cx="5731510" cy="2979420"/>
@@ -44,6 +47,9 @@
         </w:drawing>
       </w:r>
       <w:r>
+        <w:rPr>
+          <w:noProof/>
+        </w:rPr>
         <w:drawing>
           <wp:inline distT="0" distB="0" distL="0" distR="0" wp14:anchorId="173A9663" wp14:editId="7D5B2F37">
             <wp:extent cx="5731510" cy="3040380"/>
@@ -81,6 +87,9 @@
         </w:drawing>
       </w:r>
       <w:r>
+        <w:rPr>
+          <w:noProof/>
+        </w:rPr>
         <w:drawing>
           <wp:inline distT="0" distB="0" distL="0" distR="0" wp14:anchorId="1DB30A74" wp14:editId="0DD21E31">
             <wp:extent cx="5731510" cy="2013585"/>
@@ -118,6 +127,9 @@
         </w:drawing>
       </w:r>
       <w:r>
+        <w:rPr>
+          <w:noProof/>
+        </w:rPr>
         <w:lastRenderedPageBreak/>
         <w:drawing>
           <wp:inline distT="0" distB="0" distL="0" distR="0" wp14:anchorId="66456298" wp14:editId="1F93D8B9">
@@ -156,6 +168,9 @@
         </w:drawing>
       </w:r>
       <w:r>
+        <w:rPr>
+          <w:noProof/>
+        </w:rPr>
         <w:drawing>
           <wp:inline distT="0" distB="0" distL="0" distR="0" wp14:anchorId="777E6073" wp14:editId="3DEB5919">
             <wp:extent cx="5731510" cy="4006215"/>
@@ -193,6 +208,9 @@
         </w:drawing>
       </w:r>
       <w:r>
+        <w:rPr>
+          <w:noProof/>
+        </w:rPr>
         <w:lastRenderedPageBreak/>
         <w:drawing>
           <wp:inline distT="0" distB="0" distL="0" distR="0" wp14:anchorId="57A2A51E" wp14:editId="37571815">
@@ -231,6 +249,9 @@
         </w:drawing>
       </w:r>
       <w:r>
+        <w:rPr>
+          <w:noProof/>
+        </w:rPr>
         <w:drawing>
           <wp:inline distT="0" distB="0" distL="0" distR="0" wp14:anchorId="4C3181B7" wp14:editId="7828C0EE">
             <wp:extent cx="5731510" cy="1668145"/>
@@ -268,6 +289,9 @@
         </w:drawing>
       </w:r>
       <w:r>
+        <w:rPr>
+          <w:noProof/>
+        </w:rPr>
         <w:drawing>
           <wp:inline distT="0" distB="0" distL="0" distR="0" wp14:anchorId="5525E884" wp14:editId="0C0DDEAB">
             <wp:extent cx="5731510" cy="2927350"/>
@@ -293,6 +317,118 @@
                     <a:xfrm>
                       <a:off x="0" y="0"/>
                       <a:ext cx="5731510" cy="2927350"/>
+                    </a:xfrm>
+                    <a:prstGeom prst="rect">
+                      <a:avLst/>
+                    </a:prstGeom>
+                  </pic:spPr>
+                </pic:pic>
+              </a:graphicData>
+            </a:graphic>
+          </wp:inline>
+        </w:drawing>
+      </w:r>
+      <w:r>
+        <w:lastRenderedPageBreak/>
+        <w:drawing>
+          <wp:inline distT="0" distB="0" distL="0" distR="0" wp14:anchorId="11C542DB" wp14:editId="10D63F56">
+            <wp:extent cx="5731510" cy="1647190"/>
+            <wp:effectExtent l="0" t="0" r="2540" b="0"/>
+            <wp:docPr id="667510648" name="Picture 1"/>
+            <wp:cNvGraphicFramePr>
+              <a:graphicFrameLocks xmlns:a="http://schemas.openxmlformats.org/drawingml/2006/main" noChangeAspect="1"/>
+            </wp:cNvGraphicFramePr>
+            <a:graphic xmlns:a="http://schemas.openxmlformats.org/drawingml/2006/main">
+              <a:graphicData uri="http://schemas.openxmlformats.org/drawingml/2006/picture">
+                <pic:pic xmlns:pic="http://schemas.openxmlformats.org/drawingml/2006/picture">
+                  <pic:nvPicPr>
+                    <pic:cNvPr id="667510648" name=""/>
+                    <pic:cNvPicPr/>
+                  </pic:nvPicPr>
+                  <pic:blipFill>
+                    <a:blip r:embed="rId12"/>
+                    <a:stretch>
+                      <a:fillRect/>
+                    </a:stretch>
+                  </pic:blipFill>
+                  <pic:spPr>
+                    <a:xfrm>
+                      <a:off x="0" y="0"/>
+                      <a:ext cx="5731510" cy="1647190"/>
+                    </a:xfrm>
+                    <a:prstGeom prst="rect">
+                      <a:avLst/>
+                    </a:prstGeom>
+                  </pic:spPr>
+                </pic:pic>
+              </a:graphicData>
+            </a:graphic>
+          </wp:inline>
+        </w:drawing>
+      </w:r>
+      <w:r>
+        <w:drawing>
+          <wp:inline distT="0" distB="0" distL="0" distR="0" wp14:anchorId="44E55399" wp14:editId="64529141">
+            <wp:extent cx="5731510" cy="3014345"/>
+            <wp:effectExtent l="0" t="0" r="2540" b="0"/>
+            <wp:docPr id="175434925" name="Picture 1"/>
+            <wp:cNvGraphicFramePr>
+              <a:graphicFrameLocks xmlns:a="http://schemas.openxmlformats.org/drawingml/2006/main" noChangeAspect="1"/>
+            </wp:cNvGraphicFramePr>
+            <a:graphic xmlns:a="http://schemas.openxmlformats.org/drawingml/2006/main">
+              <a:graphicData uri="http://schemas.openxmlformats.org/drawingml/2006/picture">
+                <pic:pic xmlns:pic="http://schemas.openxmlformats.org/drawingml/2006/picture">
+                  <pic:nvPicPr>
+                    <pic:cNvPr id="175434925" name=""/>
+                    <pic:cNvPicPr/>
+                  </pic:nvPicPr>
+                  <pic:blipFill>
+                    <a:blip r:embed="rId13"/>
+                    <a:stretch>
+                      <a:fillRect/>
+                    </a:stretch>
+                  </pic:blipFill>
+                  <pic:spPr>
+                    <a:xfrm>
+                      <a:off x="0" y="0"/>
+                      <a:ext cx="5731510" cy="3014345"/>
+                    </a:xfrm>
+                    <a:prstGeom prst="rect">
+                      <a:avLst/>
+                    </a:prstGeom>
+                  </pic:spPr>
+                </pic:pic>
+              </a:graphicData>
+            </a:graphic>
+          </wp:inline>
+        </w:drawing>
+      </w:r>
+      <w:r>
+        <w:drawing>
+          <wp:inline distT="0" distB="0" distL="0" distR="0" wp14:anchorId="3B7B308A" wp14:editId="17653ABF">
+            <wp:extent cx="5731510" cy="2350135"/>
+            <wp:effectExtent l="0" t="0" r="2540" b="0"/>
+            <wp:docPr id="1702521560" name="Picture 1"/>
+            <wp:cNvGraphicFramePr>
+              <a:graphicFrameLocks xmlns:a="http://schemas.openxmlformats.org/drawingml/2006/main" noChangeAspect="1"/>
+            </wp:cNvGraphicFramePr>
+            <a:graphic xmlns:a="http://schemas.openxmlformats.org/drawingml/2006/main">
+              <a:graphicData uri="http://schemas.openxmlformats.org/drawingml/2006/picture">
+                <pic:pic xmlns:pic="http://schemas.openxmlformats.org/drawingml/2006/picture">
+                  <pic:nvPicPr>
+                    <pic:cNvPr id="1702521560" name=""/>
+                    <pic:cNvPicPr/>
+                  </pic:nvPicPr>
+                  <pic:blipFill>
+                    <a:blip r:embed="rId14"/>
+                    <a:stretch>
+                      <a:fillRect/>
+                    </a:stretch>
+                  </pic:blipFill>
+                  <pic:spPr>
+                    <a:xfrm>
+                      <a:off x="0" y="0"/>
+                      <a:ext cx="5731510" cy="2350135"/>
                     </a:xfrm>
                     <a:prstGeom prst="rect">
                       <a:avLst/>

</xml_diff>